<commit_message>
Revise loitering PRD per business definition alignment
- 徘徊触发口径改为：检测到人出现后计时 30s 即触发（阈值建议后续开放用户设置）
- 徘徊按人脸细分为独立事件：有人徘徊/陌生人徘徊，作为独立事件上报监控中心，固定推送文案
- 运动模式（静止/来回/移动）降级为标注槽，不参与触发
- 新增 7.5 夜晚红外指标评估规则：缺省按白天指标降 5 个百分点，以算法侧实测建议为准
- 全文 ROI 简写替换为中文全称「圈定区域」

Co-Authored-By: Claude Fable 5 <noreply@anthropic.com>
Claude-Session: https://claude.ai/code/session_01C4rKKS9mVHigxegSx9yWej
</commit_message>
<xml_diff>
--- a/徘徊检测AI产品需求文档.docx
+++ b/徘徊检测AI产品需求文档.docx
@@ -534,7 +534,7 @@
           <w:b/>
           <w:sz w:val="21"/>
         </w:rPr>
-        <w:t>圈定区域（ROI）</w:t>
+        <w:t>圈定区域</w:t>
       </w:r>
       <w:r>
         <w:rPr>
@@ -543,6 +543,36 @@
           <w:sz w:val="21"/>
         </w:rPr>
         <w:t>，只对圈定区域内的行为做徘徊判定。</w:t>
+      </w:r>
+    </w:p>
+    <w:p>
+      <w:pPr>
+        <w:pStyle w:val="ListBullet"/>
+        <w:spacing w:after="40"/>
+      </w:pPr>
+      <w:r>
+        <w:rPr>
+          <w:rFonts w:ascii="Calibri" w:hAnsi="Calibri" w:eastAsia="微软雅黑"/>
+          <w:b w:val="0"/>
+          <w:sz w:val="21"/>
+        </w:rPr>
+        <w:t>徘徊</w:t>
+      </w:r>
+      <w:r>
+        <w:rPr>
+          <w:rFonts w:ascii="Calibri" w:hAnsi="Calibri" w:eastAsia="微软雅黑"/>
+          <w:b/>
+          <w:sz w:val="21"/>
+        </w:rPr>
+        <w:t>作为独立事件类型上报监控中心</w:t>
+      </w:r>
+      <w:r>
+        <w:rPr>
+          <w:rFonts w:ascii="Calibri" w:hAnsi="Calibri" w:eastAsia="微软雅黑"/>
+          <w:b w:val="0"/>
+          <w:sz w:val="21"/>
+        </w:rPr>
+        <w:t>，按有无人脸细分为"有人徘徊"与"陌生人徘徊"两类。</w:t>
       </w:r>
     </w:p>
     <w:p>
@@ -744,7 +774,7 @@
                 <w:b w:val="0"/>
                 <w:sz w:val="19"/>
               </w:rPr>
-              <w:t>≤ 1 次/天（默认灵敏度）</w:t>
+              <w:t>白天 ≤ 1 次/天；夜晚红外 ≤ 2 次/天（默认灵敏度，见 7.5）</w:t>
             </w:r>
           </w:p>
         </w:tc>
@@ -976,7 +1006,7 @@
                 <w:b w:val="0"/>
                 <w:sz w:val="19"/>
               </w:rPr>
-              <w:t>同一身份 ID 在判定区域内</w:t>
+              <w:t>在监控画面（或圈定区域）内</w:t>
             </w:r>
             <w:r>
               <w:rPr>
@@ -984,15 +1014,15 @@
                 <w:b/>
                 <w:sz w:val="19"/>
               </w:rPr>
-              <w:t>累计驻留时长 ≥ T（默认 30s）</w:t>
-            </w:r>
-            <w:r>
-              <w:rPr>
-                <w:rFonts w:ascii="Calibri" w:hAnsi="Calibri" w:eastAsia="微软雅黑"/>
-                <w:b w:val="0"/>
-                <w:sz w:val="19"/>
-              </w:rPr>
-              <w:t>，且运动模式为"静止驻留"或"来回走动"（见 4.3 的精确定义），非单纯直线路过</w:t>
+              <w:t>检测到有人出现后即开始计时</w:t>
+            </w:r>
+            <w:r>
+              <w:rPr>
+                <w:rFonts w:ascii="Calibri" w:hAnsi="Calibri" w:eastAsia="微软雅黑"/>
+                <w:b w:val="0"/>
+                <w:sz w:val="19"/>
+              </w:rPr>
+              <w:t>，同一身份 ID 累计出现时长 ≥ T（默认 30s，建议后续业务开放给用户设置）即触发徘徊逻辑（精确规则见 4.3）</w:t>
             </w:r>
           </w:p>
         </w:tc>
@@ -1010,7 +1040,105 @@
                 <w:b w:val="0"/>
                 <w:sz w:val="19"/>
               </w:rPr>
-              <w:t>圈定区域（ROI）</w:t>
+              <w:t>有人徘徊</w:t>
+            </w:r>
+          </w:p>
+        </w:tc>
+        <w:tc>
+          <w:tcPr>
+            <w:tcW w:type="dxa" w:w="4759"/>
+            <w:shd w:val="clear" w:fill="EDF2F8"/>
+          </w:tcPr>
+          <w:p>
+            <w:r>
+              <w:rPr>
+                <w:rFonts w:ascii="Calibri" w:hAnsi="Calibri" w:eastAsia="微软雅黑"/>
+                <w:b w:val="0"/>
+                <w:sz w:val="19"/>
+              </w:rPr>
+              <w:t>触发徘徊且</w:t>
+            </w:r>
+            <w:r>
+              <w:rPr>
+                <w:rFonts w:ascii="Calibri" w:hAnsi="Calibri" w:eastAsia="微软雅黑"/>
+                <w:b/>
+                <w:sz w:val="19"/>
+              </w:rPr>
+              <w:t>无可用人脸</w:t>
+            </w:r>
+            <w:r>
+              <w:rPr>
+                <w:rFonts w:ascii="Calibri" w:hAnsi="Calibri" w:eastAsia="微软雅黑"/>
+                <w:b w:val="0"/>
+                <w:sz w:val="19"/>
+              </w:rPr>
+              <w:t>（背对/过远/遮挡，ReID 亦未关联到熟人）；推送文案："有人在区域内徘徊"</w:t>
+            </w:r>
+          </w:p>
+        </w:tc>
+      </w:tr>
+      <w:tr>
+        <w:tc>
+          <w:tcPr>
+            <w:tcW w:type="dxa" w:w="4759"/>
+          </w:tcPr>
+          <w:p>
+            <w:r>
+              <w:rPr>
+                <w:rFonts w:ascii="Calibri" w:hAnsi="Calibri" w:eastAsia="微软雅黑"/>
+                <w:b w:val="0"/>
+                <w:sz w:val="19"/>
+              </w:rPr>
+              <w:t>陌生人徘徊</w:t>
+            </w:r>
+          </w:p>
+        </w:tc>
+        <w:tc>
+          <w:tcPr>
+            <w:tcW w:type="dxa" w:w="4759"/>
+          </w:tcPr>
+          <w:p>
+            <w:r>
+              <w:rPr>
+                <w:rFonts w:ascii="Calibri" w:hAnsi="Calibri" w:eastAsia="微软雅黑"/>
+                <w:b w:val="0"/>
+                <w:sz w:val="19"/>
+              </w:rPr>
+              <w:t>触发徘徊且</w:t>
+            </w:r>
+            <w:r>
+              <w:rPr>
+                <w:rFonts w:ascii="Calibri" w:hAnsi="Calibri" w:eastAsia="微软雅黑"/>
+                <w:b/>
+                <w:sz w:val="19"/>
+              </w:rPr>
+              <w:t>有人脸、比对为陌生人</w:t>
+            </w:r>
+            <w:r>
+              <w:rPr>
+                <w:rFonts w:ascii="Calibri" w:hAnsi="Calibri" w:eastAsia="微软雅黑"/>
+                <w:b w:val="0"/>
+                <w:sz w:val="19"/>
+              </w:rPr>
+              <w:t>；推送文案："有陌生人在区域内徘徊"</w:t>
+            </w:r>
+          </w:p>
+        </w:tc>
+      </w:tr>
+      <w:tr>
+        <w:tc>
+          <w:tcPr>
+            <w:tcW w:type="dxa" w:w="4759"/>
+            <w:shd w:val="clear" w:fill="EDF2F8"/>
+          </w:tcPr>
+          <w:p>
+            <w:r>
+              <w:rPr>
+                <w:rFonts w:ascii="Calibri" w:hAnsi="Calibri" w:eastAsia="微软雅黑"/>
+                <w:b w:val="0"/>
+                <w:sz w:val="19"/>
+              </w:rPr>
+              <w:t>圈定区域</w:t>
             </w:r>
           </w:p>
         </w:tc>
@@ -1966,7 +2094,7 @@
                 <w:b w:val="0"/>
                 <w:sz w:val="19"/>
               </w:rPr>
-              <w:t>白天/夜晚红外/低照度三种模式分别验收；红外模式下不承诺熟人识别准确率达标，身份可降级为"未知"</w:t>
+              <w:t>白天/夜晚红外/低照度三种模式分别验收；红外模式下不承诺熟人识别准确率达标，身份可降级为"未知"；夜晚红外事件级指标按 7.5 的规则放宽评估（缺省降 5 个百分点）</w:t>
             </w:r>
           </w:p>
         </w:tc>
@@ -2123,7 +2251,7 @@
                 <w:b w:val="0"/>
                 <w:sz w:val="19"/>
               </w:rPr>
-              <w:t>ROI 边界抖动</w:t>
+              <w:t>圈定区域边界抖动</w:t>
             </w:r>
           </w:p>
         </w:tc>
@@ -2138,7 +2266,7 @@
                 <w:b w:val="0"/>
                 <w:sz w:val="19"/>
               </w:rPr>
-              <w:t>目标脚点（bbox 底边中点）为区域归属判定点；在区域边界 ±5% 画幅内的进出抖动做 2s 去抖，不重置计时</w:t>
+              <w:t>目标脚点（检测框底边中点）为区域归属判定点；在区域边界 ±5% 画幅内的进出抖动做 2s 去抖，不重置计时</w:t>
             </w:r>
           </w:p>
         </w:tc>
@@ -2174,6 +2302,311 @@
           <w:b/>
           <w:sz w:val="21"/>
         </w:rPr>
+        <w:t>基础触发条件（业务定义，本期触发口径）</w:t>
+      </w:r>
+      <w:r>
+        <w:rPr>
+          <w:rFonts w:ascii="Calibri" w:hAnsi="Calibri" w:eastAsia="微软雅黑"/>
+          <w:b w:val="0"/>
+          <w:sz w:val="21"/>
+        </w:rPr>
+        <w:t>：在监控画面（或用户圈定区域）内</w:t>
+      </w:r>
+      <w:r>
+        <w:rPr>
+          <w:rFonts w:ascii="Calibri" w:hAnsi="Calibri" w:eastAsia="微软雅黑"/>
+          <w:b/>
+          <w:sz w:val="21"/>
+        </w:rPr>
+        <w:t>检测到有人出现后即开始计时</w:t>
+      </w:r>
+      <w:r>
+        <w:rPr>
+          <w:rFonts w:ascii="Calibri" w:hAnsi="Calibri" w:eastAsia="微软雅黑"/>
+          <w:b w:val="0"/>
+          <w:sz w:val="21"/>
+        </w:rPr>
+        <w:t xml:space="preserve">；同一身份 ID 累计出现时长达到 </w:t>
+      </w:r>
+      <w:r>
+        <w:rPr>
+          <w:rFonts w:ascii="Calibri" w:hAnsi="Calibri" w:eastAsia="微软雅黑"/>
+          <w:b/>
+          <w:sz w:val="21"/>
+        </w:rPr>
+        <w:t>T（默认 30s）</w:t>
+      </w:r>
+      <w:r>
+        <w:rPr>
+          <w:rFonts w:ascii="Calibri" w:hAnsi="Calibri" w:eastAsia="微软雅黑"/>
+          <w:b w:val="0"/>
+          <w:sz w:val="21"/>
+        </w:rPr>
+        <w:t xml:space="preserve"> 即触发徘徊逻辑，生成徘徊事件。阈值 T 本期固定为 30s，</w:t>
+      </w:r>
+      <w:r>
+        <w:rPr>
+          <w:rFonts w:ascii="Calibri" w:hAnsi="Calibri" w:eastAsia="微软雅黑"/>
+          <w:b/>
+          <w:sz w:val="21"/>
+        </w:rPr>
+        <w:t>建议后续业务开放给用户设置</w:t>
+      </w:r>
+      <w:r>
+        <w:rPr>
+          <w:rFonts w:ascii="Calibri" w:hAnsi="Calibri" w:eastAsia="微软雅黑"/>
+          <w:b w:val="0"/>
+          <w:sz w:val="21"/>
+        </w:rPr>
+        <w:t>（范围 10s–300s）。</w:t>
+      </w:r>
+    </w:p>
+    <w:p>
+      <w:pPr>
+        <w:spacing w:after="120"/>
+      </w:pPr>
+      <w:r>
+        <w:rPr>
+          <w:rFonts w:ascii="Calibri" w:hAnsi="Calibri" w:eastAsia="微软雅黑"/>
+          <w:b/>
+          <w:sz w:val="21"/>
+        </w:rPr>
+        <w:t>身份分支与事件判定（触发后执行）</w:t>
+      </w:r>
+      <w:r>
+        <w:rPr>
+          <w:rFonts w:ascii="Calibri" w:hAnsi="Calibri" w:eastAsia="微软雅黑"/>
+          <w:b w:val="0"/>
+          <w:sz w:val="21"/>
+        </w:rPr>
+        <w:t>：</w:t>
+      </w:r>
+    </w:p>
+    <w:tbl>
+      <w:tblPr>
+        <w:tblStyle w:val="TableGrid"/>
+        <w:tblW w:type="auto" w:w="0"/>
+        <w:jc w:val="center"/>
+        <w:tblLook w:firstColumn="1" w:firstRow="1" w:lastColumn="0" w:lastRow="0" w:noHBand="0" w:noVBand="1" w:val="04A0"/>
+      </w:tblPr>
+      <w:tblGrid>
+        <w:gridCol w:w="3173"/>
+        <w:gridCol w:w="3173"/>
+        <w:gridCol w:w="3173"/>
+      </w:tblGrid>
+      <w:tr>
+        <w:tc>
+          <w:tcPr>
+            <w:tcW w:type="dxa" w:w="3173"/>
+            <w:shd w:val="clear" w:fill="1F4E79"/>
+          </w:tcPr>
+          <w:p>
+            <w:r>
+              <w:rPr>
+                <w:rFonts w:ascii="Calibri" w:hAnsi="Calibri" w:eastAsia="微软雅黑"/>
+                <w:b/>
+                <w:color w:val="FFFFFF"/>
+                <w:sz w:val="20"/>
+              </w:rPr>
+              <w:t>人脸情况</w:t>
+            </w:r>
+          </w:p>
+        </w:tc>
+        <w:tc>
+          <w:tcPr>
+            <w:tcW w:type="dxa" w:w="3173"/>
+            <w:shd w:val="clear" w:fill="1F4E79"/>
+          </w:tcPr>
+          <w:p>
+            <w:r>
+              <w:rPr>
+                <w:rFonts w:ascii="Calibri" w:hAnsi="Calibri" w:eastAsia="微软雅黑"/>
+                <w:b/>
+                <w:color w:val="FFFFFF"/>
+                <w:sz w:val="20"/>
+              </w:rPr>
+              <w:t>事件判定</w:t>
+            </w:r>
+          </w:p>
+        </w:tc>
+        <w:tc>
+          <w:tcPr>
+            <w:tcW w:type="dxa" w:w="3173"/>
+            <w:shd w:val="clear" w:fill="1F4E79"/>
+          </w:tcPr>
+          <w:p>
+            <w:r>
+              <w:rPr>
+                <w:rFonts w:ascii="Calibri" w:hAnsi="Calibri" w:eastAsia="微软雅黑"/>
+                <w:b/>
+                <w:color w:val="FFFFFF"/>
+                <w:sz w:val="20"/>
+              </w:rPr>
+              <w:t>推送文案（固定口径）</w:t>
+            </w:r>
+          </w:p>
+        </w:tc>
+      </w:tr>
+      <w:tr>
+        <w:tc>
+          <w:tcPr>
+            <w:tcW w:type="dxa" w:w="3173"/>
+          </w:tcPr>
+          <w:p>
+            <w:r>
+              <w:rPr>
+                <w:rFonts w:ascii="Calibri" w:hAnsi="Calibri" w:eastAsia="微软雅黑"/>
+                <w:b w:val="0"/>
+                <w:sz w:val="19"/>
+              </w:rPr>
+              <w:t>无人脸（背对/过远/遮挡，且 ReID 未关联到熟人）</w:t>
+            </w:r>
+          </w:p>
+        </w:tc>
+        <w:tc>
+          <w:tcPr>
+            <w:tcW w:type="dxa" w:w="3173"/>
+          </w:tcPr>
+          <w:p>
+            <w:r>
+              <w:rPr>
+                <w:rFonts w:ascii="Calibri" w:hAnsi="Calibri" w:eastAsia="微软雅黑"/>
+                <w:b/>
+                <w:sz w:val="19"/>
+              </w:rPr>
+              <w:t>有人徘徊</w:t>
+            </w:r>
+          </w:p>
+        </w:tc>
+        <w:tc>
+          <w:tcPr>
+            <w:tcW w:type="dxa" w:w="3173"/>
+          </w:tcPr>
+          <w:p>
+            <w:r>
+              <w:rPr>
+                <w:rFonts w:ascii="Calibri" w:hAnsi="Calibri" w:eastAsia="微软雅黑"/>
+                <w:b w:val="0"/>
+                <w:sz w:val="19"/>
+              </w:rPr>
+              <w:t>"有人在区域内徘徊"</w:t>
+            </w:r>
+          </w:p>
+        </w:tc>
+      </w:tr>
+      <w:tr>
+        <w:tc>
+          <w:tcPr>
+            <w:tcW w:type="dxa" w:w="3173"/>
+            <w:shd w:val="clear" w:fill="EDF2F8"/>
+          </w:tcPr>
+          <w:p>
+            <w:r>
+              <w:rPr>
+                <w:rFonts w:ascii="Calibri" w:hAnsi="Calibri" w:eastAsia="微软雅黑"/>
+                <w:b w:val="0"/>
+                <w:sz w:val="19"/>
+              </w:rPr>
+              <w:t>有人脸，且比对为陌生人</w:t>
+            </w:r>
+          </w:p>
+        </w:tc>
+        <w:tc>
+          <w:tcPr>
+            <w:tcW w:type="dxa" w:w="3173"/>
+            <w:shd w:val="clear" w:fill="EDF2F8"/>
+          </w:tcPr>
+          <w:p>
+            <w:r>
+              <w:rPr>
+                <w:rFonts w:ascii="Calibri" w:hAnsi="Calibri" w:eastAsia="微软雅黑"/>
+                <w:b/>
+                <w:sz w:val="19"/>
+              </w:rPr>
+              <w:t>陌生人徘徊</w:t>
+            </w:r>
+          </w:p>
+        </w:tc>
+        <w:tc>
+          <w:tcPr>
+            <w:tcW w:type="dxa" w:w="3173"/>
+            <w:shd w:val="clear" w:fill="EDF2F8"/>
+          </w:tcPr>
+          <w:p>
+            <w:r>
+              <w:rPr>
+                <w:rFonts w:ascii="Calibri" w:hAnsi="Calibri" w:eastAsia="微软雅黑"/>
+                <w:b w:val="0"/>
+                <w:sz w:val="19"/>
+              </w:rPr>
+              <w:t>"有陌生人在区域内徘徊"</w:t>
+            </w:r>
+          </w:p>
+        </w:tc>
+      </w:tr>
+      <w:tr>
+        <w:tc>
+          <w:tcPr>
+            <w:tcW w:type="dxa" w:w="3173"/>
+          </w:tcPr>
+          <w:p>
+            <w:r>
+              <w:rPr>
+                <w:rFonts w:ascii="Calibri" w:hAnsi="Calibri" w:eastAsia="微软雅黑"/>
+                <w:b w:val="0"/>
+                <w:sz w:val="19"/>
+              </w:rPr>
+              <w:t>有人脸，且比对为熟人</w:t>
+            </w:r>
+          </w:p>
+        </w:tc>
+        <w:tc>
+          <w:tcPr>
+            <w:tcW w:type="dxa" w:w="3173"/>
+          </w:tcPr>
+          <w:p>
+            <w:r>
+              <w:rPr>
+                <w:rFonts w:ascii="Calibri" w:hAnsi="Calibri" w:eastAsia="微软雅黑"/>
+                <w:b w:val="0"/>
+                <w:sz w:val="19"/>
+              </w:rPr>
+              <w:t>熟人驻留（默认仅记录不推送，可配置）</w:t>
+            </w:r>
+          </w:p>
+        </w:tc>
+        <w:tc>
+          <w:tcPr>
+            <w:tcW w:type="dxa" w:w="3173"/>
+          </w:tcPr>
+          <w:p>
+            <w:r>
+              <w:rPr>
+                <w:rFonts w:ascii="Calibri" w:hAnsi="Calibri" w:eastAsia="微软雅黑"/>
+                <w:b w:val="0"/>
+                <w:sz w:val="19"/>
+              </w:rPr>
+              <w:t>"（人员标签）在区域内停留"</w:t>
+            </w:r>
+          </w:p>
+        </w:tc>
+      </w:tr>
+    </w:tbl>
+    <w:p>
+      <w:pPr>
+        <w:spacing w:after="40"/>
+      </w:pPr>
+    </w:p>
+    <w:p>
+      <w:pPr>
+        <w:spacing w:after="120"/>
+      </w:pPr>
+      <w:r>
+        <w:rPr>
+          <w:rFonts w:ascii="Calibri" w:hAnsi="Calibri" w:eastAsia="微软雅黑"/>
+          <w:b/>
+          <w:sz w:val="21"/>
+        </w:rPr>
         <w:t>判定主体</w:t>
       </w:r>
       <w:r>
@@ -2182,7 +2615,7 @@
           <w:b w:val="0"/>
           <w:sz w:val="21"/>
         </w:rPr>
-        <w:t>：单个身份 ID（优先 Global ID，退化为 Track ID）。</w:t>
+        <w:t>：单个身份 ID（优先跨镜统一 ID，退化为单镜跟踪 ID）。</w:t>
       </w:r>
     </w:p>
     <w:p>
@@ -2203,7 +2636,7 @@
           <w:b w:val="0"/>
           <w:sz w:val="21"/>
         </w:rPr>
-        <w:t>：某个 ROI（未圈定则全画面）。</w:t>
+        <w:t>：某个圈定区域（未圈定则全画面）。</w:t>
       </w:r>
     </w:p>
     <w:p>
@@ -2224,7 +2657,7 @@
           <w:b w:val="0"/>
           <w:sz w:val="21"/>
         </w:rPr>
-        <w:t>：目标 bbox 底边中点（脚点）落在 ROI 多边形内。</w:t>
+        <w:t>：目标检测框底边中点（脚点）落在圈定区域多边形内。</w:t>
       </w:r>
     </w:p>
     <w:p>
@@ -2237,7 +2670,7 @@
           <w:b/>
           <w:sz w:val="21"/>
         </w:rPr>
-        <w:t>驻留时长累计规则</w:t>
+        <w:t>出现时长累计规则</w:t>
       </w:r>
     </w:p>
     <w:p>
@@ -2260,7 +2693,7 @@
           <w:b w:val="0"/>
           <w:sz w:val="21"/>
         </w:rPr>
-        <w:t>脚点进入 ROI，启动该 (ID, ROI) 计时器；</w:t>
+        <w:t>脚点进入圈定区域，启动该（ID, 圈定区域）计时器；</w:t>
       </w:r>
     </w:p>
     <w:p>
@@ -2283,7 +2716,7 @@
           <w:b w:val="0"/>
           <w:sz w:val="21"/>
         </w:rPr>
-        <w:t xml:space="preserve">脚点离开 ROI 后 </w:t>
+        <w:t xml:space="preserve">脚点离开圈定区域后 </w:t>
       </w:r>
       <w:r>
         <w:rPr>
@@ -2351,7 +2784,7 @@
           <w:b/>
           <w:sz w:val="21"/>
         </w:rPr>
-        <w:t>触发条件</w:t>
+        <w:t>运动模式子类（仅用于事件标注与描述增强，不作为触发门槛）</w:t>
       </w:r>
       <w:r>
         <w:rPr>
@@ -2359,7 +2792,7 @@
           <w:b w:val="0"/>
           <w:sz w:val="21"/>
         </w:rPr>
-        <w:t>（满足其一即触发徘徊事件）：</w:t>
+        <w:t>：</w:t>
       </w:r>
     </w:p>
     <w:p>
@@ -2381,7 +2814,7 @@
           <w:b w:val="0"/>
           <w:sz w:val="21"/>
         </w:rPr>
-        <w:t>：累计驻留 ≥ T（默认 30s），且期间目标净位移 &lt; 自身身高的 1.5 倍（"基本没动"）；</w:t>
+        <w:t>：期间目标净位移 &lt; 自身身高的 1.5 倍（"基本没动"）；</w:t>
       </w:r>
     </w:p>
     <w:p>
@@ -2403,7 +2836,7 @@
           <w:b w:val="0"/>
           <w:sz w:val="21"/>
         </w:rPr>
-        <w:t xml:space="preserve">：累计驻留 ≥ T，且 </w:t>
+        <w:t>：</w:t>
       </w:r>
       <w:r>
         <w:rPr>
@@ -2434,7 +2867,7 @@
           <w:b/>
           <w:sz w:val="21"/>
         </w:rPr>
-        <w:t>反复出没型</w:t>
+        <w:t>移动停留型</w:t>
       </w:r>
       <w:r>
         <w:rPr>
@@ -2442,7 +2875,7 @@
           <w:b w:val="0"/>
           <w:sz w:val="21"/>
         </w:rPr>
-        <w:t>（可选开关，默认关）：10 分钟内同一 ID 进出同一 ROI ≥ 3 次。</w:t>
+        <w:t>：不满足以上两类、在区域内持续活动。</w:t>
       </w:r>
     </w:p>
     <w:p>
@@ -2455,7 +2888,7 @@
           <w:b/>
           <w:sz w:val="21"/>
         </w:rPr>
-        <w:t>排除条件</w:t>
+        <w:t>抑制与排除规则</w:t>
       </w:r>
       <w:r>
         <w:rPr>
@@ -2464,20 +2897,6 @@
           <w:sz w:val="21"/>
         </w:rPr>
         <w:t>：</w:t>
-      </w:r>
-    </w:p>
-    <w:p>
-      <w:pPr>
-        <w:pStyle w:val="ListBullet"/>
-        <w:spacing w:after="40"/>
-      </w:pPr>
-      <w:r>
-        <w:rPr>
-          <w:rFonts w:ascii="Calibri" w:hAnsi="Calibri" w:eastAsia="微软雅黑"/>
-          <w:b w:val="0"/>
-          <w:sz w:val="21"/>
-        </w:rPr>
-        <w:t>累计驻留 ≥ T 但轨迹为单向近直线穿越（折返比 &lt; 1.5 且持续朝一个方向）→ 判为"缓慢路过"，不报徘徊；</w:t>
       </w:r>
     </w:p>
     <w:p>
@@ -2505,7 +2924,7 @@
           <w:b w:val="0"/>
           <w:sz w:val="21"/>
         </w:rPr>
-        <w:t xml:space="preserve">同一 (ID, ROI) 触发徘徊后进入 </w:t>
+        <w:t xml:space="preserve">同一（ID, 圈定区域）触发徘徊后进入 </w:t>
       </w:r>
       <w:r>
         <w:rPr>
@@ -2521,7 +2940,29 @@
           <w:b w:val="0"/>
           <w:sz w:val="21"/>
         </w:rPr>
-        <w:t>，期间持续徘徊只更新原事件时长，不重复推送。</w:t>
+        <w:t>，期间持续徘徊只更新原事件时长，不重复推送；</w:t>
+      </w:r>
+    </w:p>
+    <w:p>
+      <w:pPr>
+        <w:pStyle w:val="ListBullet"/>
+        <w:spacing w:after="40"/>
+      </w:pPr>
+      <w:r>
+        <w:rPr>
+          <w:rFonts w:ascii="Calibri" w:hAnsi="Calibri" w:eastAsia="微软雅黑"/>
+          <w:b/>
+          <w:sz w:val="21"/>
+        </w:rPr>
+        <w:t>缓慢直线路过排除</w:t>
+      </w:r>
+      <w:r>
+        <w:rPr>
+          <w:rFonts w:ascii="Calibri" w:hAnsi="Calibri" w:eastAsia="微软雅黑"/>
+          <w:b w:val="0"/>
+          <w:sz w:val="21"/>
+        </w:rPr>
+        <w:t>（可选开关，默认关闭）：累计出现 ≥ T 但轨迹为单向近直线穿越（折返比 &lt; 1.5 且持续朝一个方向）时判为"缓慢路过"不报徘徊；若上线后此类误报偏高，可按点位开启。</w:t>
       </w:r>
     </w:p>
     <w:p>
@@ -2536,7 +2977,7 @@
           <w:color w:val="1F4E79"/>
           <w:sz w:val="25"/>
         </w:rPr>
-        <w:t>4.4 圈定区域（ROI）交互需求</w:t>
+        <w:t>4.4 圈定区域交互需求</w:t>
       </w:r>
     </w:p>
     <w:p>
@@ -2575,7 +3016,7 @@
           <w:b w:val="0"/>
           <w:sz w:val="21"/>
         </w:rPr>
-        <w:t>（3–10 个顶点），支持拖拽顶点微调；每路摄像头最多 4 个 ROI，可命名（"大门""围墙西侧"）。</w:t>
+        <w:t>（3–10 个顶点），支持拖拽顶点微调；每路摄像头最多 4 个圈定区域，可命名（"大门""围墙西侧"）。</w:t>
       </w:r>
     </w:p>
     <w:p>
@@ -2598,7 +3039,7 @@
           <w:b w:val="0"/>
           <w:sz w:val="21"/>
         </w:rPr>
-        <w:t>每个 ROI 独立配置：徘徊阈值 T、灵敏度档位、布防时间表、告警身份范围（所有人/仅陌生人）、事件抑制期时长。</w:t>
+        <w:t>每个圈定区域独立配置：徘徊阈值 T、灵敏度档位、布防时间表、告警身份范围（所有人/仅陌生人）、事件抑制期时长。</w:t>
       </w:r>
     </w:p>
     <w:p>
@@ -2621,7 +3062,7 @@
           <w:b w:val="0"/>
           <w:sz w:val="21"/>
         </w:rPr>
-        <w:t>提供"默认全画面"一键模式；ROI 修改即时生效，修改时清空该 ROI 在途计时器。</w:t>
+        <w:t>提供"默认全画面"一键模式；圈定区域修改即时生效，修改时清空该区域在途计时器。</w:t>
       </w:r>
     </w:p>
     <w:p>
@@ -2644,7 +3085,7 @@
           <w:b w:val="0"/>
           <w:sz w:val="21"/>
         </w:rPr>
-        <w:t>画面中实时叠加 ROI 半透明高亮与目标框（熟人绿色/陌生人橙色/徘徊中红色 + 已驻留秒数角标），用于用户调试灵敏度。</w:t>
+        <w:t>画面中实时叠加圈定区域半透明高亮与目标框（熟人绿色/陌生人橙色/徘徊中红色 + 已出现秒数角标），用于用户调试灵敏度。</w:t>
       </w:r>
     </w:p>
     <w:p>
@@ -2667,7 +3108,7 @@
           <w:b w:val="0"/>
           <w:sz w:val="21"/>
         </w:rPr>
-        <w:t>ROI 以摄像头分辨率归一化坐标存储，分辨率切换不失效。</w:t>
+        <w:t>圈定区域以摄像头分辨率归一化坐标存储，分辨率切换不失效。</w:t>
       </w:r>
     </w:p>
     <w:p>
@@ -2683,6 +3124,58 @@
           <w:sz w:val="25"/>
         </w:rPr>
         <w:t>4.5 事件呈现与推送</w:t>
+      </w:r>
+    </w:p>
+    <w:p>
+      <w:pPr>
+        <w:pStyle w:val="ListBullet"/>
+        <w:spacing w:after="40"/>
+      </w:pPr>
+      <w:r>
+        <w:rPr>
+          <w:rFonts w:ascii="Calibri" w:hAnsi="Calibri" w:eastAsia="微软雅黑"/>
+          <w:b/>
+          <w:sz w:val="21"/>
+        </w:rPr>
+        <w:t>徘徊作为独立事件类型上报监控中心</w:t>
+      </w:r>
+      <w:r>
+        <w:rPr>
+          <w:rFonts w:ascii="Calibri" w:hAnsi="Calibri" w:eastAsia="微软雅黑"/>
+          <w:b w:val="0"/>
+          <w:sz w:val="21"/>
+        </w:rPr>
+        <w:t>：不并入"陌生人出现/熟人到访"等既有事件；同一目标先触发"陌生人出现"、后满足徘徊条件时，徘徊</w:t>
+      </w:r>
+      <w:r>
+        <w:rPr>
+          <w:rFonts w:ascii="Calibri" w:hAnsi="Calibri" w:eastAsia="微软雅黑"/>
+          <w:b/>
+          <w:sz w:val="21"/>
+        </w:rPr>
+        <w:t>单独生成一条事件</w:t>
+      </w:r>
+      <w:r>
+        <w:rPr>
+          <w:rFonts w:ascii="Calibri" w:hAnsi="Calibri" w:eastAsia="微软雅黑"/>
+          <w:b w:val="0"/>
+          <w:sz w:val="21"/>
+        </w:rPr>
+        <w:t>上报（原事件保留），且徘徊事件优先级更高。</w:t>
+      </w:r>
+    </w:p>
+    <w:p>
+      <w:pPr>
+        <w:pStyle w:val="ListBullet"/>
+        <w:spacing w:after="40"/>
+      </w:pPr>
+      <w:r>
+        <w:rPr>
+          <w:rFonts w:ascii="Calibri" w:hAnsi="Calibri" w:eastAsia="微软雅黑"/>
+          <w:b w:val="0"/>
+          <w:sz w:val="21"/>
+        </w:rPr>
+        <w:t>徘徊推送文案为固定口径：无人脸 →"有人在区域内徘徊"；有人脸且为陌生人 →"有陌生人在区域内徘徊"。LLM 生成的详细描述作为事件卡片的补充说明，不替换固定推送文案。</w:t>
       </w:r>
     </w:p>
     <w:p>
@@ -2710,7 +3203,7 @@
           <w:b w:val="0"/>
           <w:sz w:val="21"/>
         </w:rPr>
-        <w:t>时间线支持按事件类型（熟人到访/陌生人出现/徘徊）、按摄像头、按 ROI、按人员筛选。</w:t>
+        <w:t>时间线支持按事件类型（熟人到访/陌生人出现/有人徘徊/陌生人徘徊）、按摄像头、按圈定区域、按人员筛选。</w:t>
       </w:r>
     </w:p>
     <w:p>
@@ -2946,7 +3439,7 @@
           <w:b w:val="0"/>
           <w:sz w:val="21"/>
         </w:rPr>
-        <w:t>：时长、折返比是可解释、可让用户调参的量；模型只负责"看得准"（①–④），规则负责"判得稳"。这也是学术界主流做法（YOLO + DeepSORT/跟踪 + 时长/位移阈值判定，见 IEEE 2020 多摄像头徘徊检测、MDPI JSAN 2023 时空信息徘徊检测等论文）。</w:t>
+        <w:t>：出现时长阈值是可解释、可开放给用户设置的量；模型只负责"看得准"（①–④），规则负责"判得稳"。这也是学术界主流做法（YOLO + DeepSORT/跟踪 + 时长/位移阈值判定，见 IEEE 2020 多摄像头徘徊检测、MDPI JSAN 2023 时空信息徘徊检测等论文）。</w:t>
       </w:r>
     </w:p>
     <w:p>
@@ -3183,7 +3676,41 @@
                 <w:color w:val="C7254E"/>
                 <w:sz w:val="19"/>
               </w:rPr>
-              <w:t>loitering</w:t>
+              <w:t>loitering_person</w:t>
+            </w:r>
+            <w:r>
+              <w:rPr>
+                <w:rFonts w:ascii="Calibri" w:hAnsi="Calibri" w:eastAsia="微软雅黑"/>
+                <w:b w:val="0"/>
+                <w:sz w:val="19"/>
+              </w:rPr>
+              <w:t xml:space="preserve">（有人徘徊）/ </w:t>
+            </w:r>
+            <w:r>
+              <w:rPr>
+                <w:rFonts w:ascii="Consolas" w:hAnsi="Consolas" w:eastAsia="等线"/>
+                <w:b w:val="0"/>
+                <w:color w:val="C7254E"/>
+                <w:sz w:val="19"/>
+              </w:rPr>
+              <w:t>loitering_stranger</w:t>
+            </w:r>
+            <w:r>
+              <w:rPr>
+                <w:rFonts w:ascii="Calibri" w:hAnsi="Calibri" w:eastAsia="微软雅黑"/>
+                <w:b w:val="0"/>
+                <w:sz w:val="19"/>
+              </w:rPr>
+              <w:t xml:space="preserve">（陌生人徘徊）/ </w:t>
+            </w:r>
+            <w:r>
+              <w:rPr>
+                <w:rFonts w:ascii="Consolas" w:hAnsi="Consolas" w:eastAsia="等线"/>
+                <w:b w:val="0"/>
+                <w:color w:val="C7254E"/>
+                <w:sz w:val="19"/>
+              </w:rPr>
+              <w:t>stranger_appear</w:t>
             </w:r>
             <w:r>
               <w:rPr>
@@ -3200,24 +3727,23 @@
                 <w:color w:val="C7254E"/>
                 <w:sz w:val="19"/>
               </w:rPr>
-              <w:t>stranger_appear</w:t>
-            </w:r>
-            <w:r>
-              <w:rPr>
-                <w:rFonts w:ascii="Calibri" w:hAnsi="Calibri" w:eastAsia="微软雅黑"/>
-                <w:b w:val="0"/>
-                <w:sz w:val="19"/>
-              </w:rPr>
-              <w:t xml:space="preserve"> / </w:t>
-            </w:r>
-            <w:r>
-              <w:rPr>
-                <w:rFonts w:ascii="Consolas" w:hAnsi="Consolas" w:eastAsia="等线"/>
-                <w:b w:val="0"/>
-                <w:color w:val="C7254E"/>
-                <w:sz w:val="19"/>
-              </w:rPr>
               <w:t>known_person_appear</w:t>
+            </w:r>
+            <w:r>
+              <w:rPr>
+                <w:rFonts w:ascii="Calibri" w:hAnsi="Calibri" w:eastAsia="微软雅黑"/>
+                <w:b w:val="0"/>
+                <w:sz w:val="19"/>
+              </w:rPr>
+              <w:t>；徘徊为</w:t>
+            </w:r>
+            <w:r>
+              <w:rPr>
+                <w:rFonts w:ascii="Calibri" w:hAnsi="Calibri" w:eastAsia="微软雅黑"/>
+                <w:b/>
+                <w:sz w:val="19"/>
+              </w:rPr>
+              <w:t>独立事件类型，单独上报监控中心</w:t>
             </w:r>
           </w:p>
         </w:tc>
@@ -3232,7 +3758,7 @@
                 <w:b w:val="0"/>
                 <w:sz w:val="19"/>
               </w:rPr>
-              <w:t>规则引擎</w:t>
+              <w:t>规则引擎 + 人脸比对</w:t>
             </w:r>
           </w:p>
         </w:tc>
@@ -3527,7 +4053,7 @@
                 <w:b w:val="0"/>
                 <w:sz w:val="19"/>
               </w:rPr>
-              <w:t xml:space="preserve">ROI 编号与用户命名；全画面时为 </w:t>
+              <w:t xml:space="preserve">圈定区域编号与用户命名；全画面时为 </w:t>
             </w:r>
             <w:r>
               <w:rPr>
@@ -3820,15 +4346,23 @@
                 <w:color w:val="C7254E"/>
                 <w:sz w:val="19"/>
               </w:rPr>
-              <w:t>repeated_entry</w:t>
-            </w:r>
-            <w:r>
-              <w:rPr>
-                <w:rFonts w:ascii="Calibri" w:hAnsi="Calibri" w:eastAsia="微软雅黑"/>
-                <w:b w:val="0"/>
-                <w:sz w:val="19"/>
-              </w:rPr>
-              <w:t>（反复出没）</w:t>
+              <w:t>moving</w:t>
+            </w:r>
+            <w:r>
+              <w:rPr>
+                <w:rFonts w:ascii="Calibri" w:hAnsi="Calibri" w:eastAsia="微软雅黑"/>
+                <w:b w:val="0"/>
+                <w:sz w:val="19"/>
+              </w:rPr>
+              <w:t>（移动停留）；仅作标注与描述增强，</w:t>
+            </w:r>
+            <w:r>
+              <w:rPr>
+                <w:rFonts w:ascii="Calibri" w:hAnsi="Calibri" w:eastAsia="微软雅黑"/>
+                <w:b/>
+                <w:sz w:val="19"/>
+              </w:rPr>
+              <w:t>不参与触发判定</w:t>
             </w:r>
           </w:p>
         </w:tc>
@@ -4201,7 +4735,7 @@
                 <w:b w:val="0"/>
                 <w:sz w:val="19"/>
               </w:rPr>
-              <w:t>自然语言一句话描述（≤ 40 字）</w:t>
+              <w:t>自然语言一句话描述（≤ 40 字）；徘徊推送标题用固定文案（见 4.5），LLM 描述作卡片补充</w:t>
             </w:r>
           </w:p>
         </w:tc>
@@ -4343,7 +4877,7 @@
           <w:b/>
           <w:sz w:val="21"/>
         </w:rPr>
-        <w:t>S1、S2、S7 是决定"报不报、报什么"的三个核心语义槽</w:t>
+        <w:t>S1、S2 是决定"报不报、报什么"的核心语义槽</w:t>
       </w:r>
       <w:r>
         <w:rPr>
@@ -4351,7 +4885,7 @@
           <w:b w:val="0"/>
           <w:sz w:val="21"/>
         </w:rPr>
-        <w:t>，S4/S8 是限定槽，S11 为呈现槽。第 7 章逐槽给出准召指标。</w:t>
+        <w:t>（徘徊触发后由 S2 的人脸结果决定"有人徘徊"还是"陌生人徘徊"），S7 为标注槽，S4/S8 是限定槽，S11 为呈现槽。第 7 章逐槽给出准召指标。</w:t>
       </w:r>
     </w:p>
     <w:p>
@@ -5648,24 +6182,7 @@
                 <w:b w:val="0"/>
                 <w:sz w:val="19"/>
               </w:rPr>
-              <w:t>=</w:t>
-            </w:r>
-            <w:r>
-              <w:rPr>
-                <w:rFonts w:ascii="Consolas" w:hAnsi="Consolas" w:eastAsia="等线"/>
-                <w:b w:val="0"/>
-                <w:color w:val="C7254E"/>
-                <w:sz w:val="19"/>
-              </w:rPr>
-              <w:t>loitering</w:t>
-            </w:r>
-            <w:r>
-              <w:rPr>
-                <w:rFonts w:ascii="Calibri" w:hAnsi="Calibri" w:eastAsia="微软雅黑"/>
-                <w:b w:val="0"/>
-                <w:sz w:val="19"/>
-              </w:rPr>
-              <w:t>（徘徊事件）</w:t>
+              <w:t>=徘徊（含有人徘徊/陌生人徘徊）</w:t>
             </w:r>
           </w:p>
         </w:tc>
@@ -5680,7 +6197,7 @@
                 <w:b w:val="0"/>
                 <w:sz w:val="19"/>
               </w:rPr>
-              <w:t>事件 P / R + FAR</w:t>
+              <w:t>事件 P / R + FAR（白天口径）</w:t>
             </w:r>
           </w:p>
         </w:tc>
@@ -5725,7 +6242,7 @@
                 <w:b w:val="0"/>
                 <w:sz w:val="19"/>
               </w:rPr>
-              <w:t>北极星；时长误差另行约束（见 S8）</w:t>
+              <w:t>北极星；夜晚红外按 7.5 放宽评估；时长误差另行约束（见 S8）</w:t>
             </w:r>
           </w:p>
         </w:tc>
@@ -5743,16 +6260,7 @@
                 <w:b w:val="0"/>
                 <w:sz w:val="19"/>
               </w:rPr>
-              <w:t>S1 =</w:t>
-            </w:r>
-            <w:r>
-              <w:rPr>
-                <w:rFonts w:ascii="Consolas" w:hAnsi="Consolas" w:eastAsia="等线"/>
-                <w:b w:val="0"/>
-                <w:color w:val="C7254E"/>
-                <w:sz w:val="19"/>
-              </w:rPr>
-              <w:t>stranger_appear</w:t>
+              <w:t>S1 徘徊身份细分（有人徘徊 vs 陌生人徘徊判对）</w:t>
             </w:r>
           </w:p>
         </w:tc>
@@ -5768,7 +6276,7 @@
                 <w:b w:val="0"/>
                 <w:sz w:val="19"/>
               </w:rPr>
-              <w:t>事件 P / R</w:t>
+              <w:t>细分正确率</w:t>
             </w:r>
           </w:p>
         </w:tc>
@@ -5784,7 +6292,7 @@
                 <w:b w:val="0"/>
                 <w:sz w:val="19"/>
               </w:rPr>
-              <w:t>P≥88% / R≥90%</w:t>
+              <w:t>≥90%</w:t>
             </w:r>
           </w:p>
         </w:tc>
@@ -5800,7 +6308,7 @@
                 <w:b w:val="0"/>
                 <w:sz w:val="19"/>
               </w:rPr>
-              <w:t>P≥93% / R≥95%</w:t>
+              <w:t>≥95%</w:t>
             </w:r>
           </w:p>
         </w:tc>
@@ -5816,7 +6324,7 @@
                 <w:b w:val="0"/>
                 <w:sz w:val="19"/>
               </w:rPr>
-              <w:t>陌生人宁可多报（R 优先）</w:t>
+              <w:t>无可用人脸时判"有人徘徊"视为正确；熟人被误报进徘徊告警单独统计 ≤2%</w:t>
             </w:r>
           </w:p>
         </w:tc>
@@ -5842,7 +6350,7 @@
                 <w:color w:val="C7254E"/>
                 <w:sz w:val="19"/>
               </w:rPr>
-              <w:t>known_person_appear</w:t>
+              <w:t>stranger_appear</w:t>
             </w:r>
           </w:p>
         </w:tc>
@@ -5872,7 +6380,7 @@
                 <w:b w:val="0"/>
                 <w:sz w:val="19"/>
               </w:rPr>
-              <w:t>P≥95% / R≥85%</w:t>
+              <w:t>P≥88% / R≥90%</w:t>
             </w:r>
           </w:p>
         </w:tc>
@@ -5887,7 +6395,7 @@
                 <w:b w:val="0"/>
                 <w:sz w:val="19"/>
               </w:rPr>
-              <w:t>P≥97% / R≥92%</w:t>
+              <w:t>P≥93% / R≥95%</w:t>
             </w:r>
           </w:p>
         </w:tc>
@@ -5902,7 +6410,7 @@
                 <w:b w:val="0"/>
                 <w:sz w:val="19"/>
               </w:rPr>
-              <w:t>熟人误标陌生人会引发误告警，P 优先</w:t>
+              <w:t>陌生人宁可多报（R 优先）</w:t>
             </w:r>
           </w:p>
         </w:tc>
@@ -5920,7 +6428,7 @@
                 <w:b w:val="0"/>
                 <w:sz w:val="19"/>
               </w:rPr>
-              <w:t xml:space="preserve">S2 </w:t>
+              <w:t>S1 =</w:t>
             </w:r>
             <w:r>
               <w:rPr>
@@ -5929,7 +6437,7 @@
                 <w:color w:val="C7254E"/>
                 <w:sz w:val="19"/>
               </w:rPr>
-              <w:t>person_identity</w:t>
+              <w:t>known_person_appear</w:t>
             </w:r>
           </w:p>
         </w:tc>
@@ -5945,7 +6453,7 @@
                 <w:b w:val="0"/>
                 <w:sz w:val="19"/>
               </w:rPr>
-              <w:t>槽准确率（在事件被报出的前提下身份判对）</w:t>
+              <w:t>事件 P / R</w:t>
             </w:r>
           </w:p>
         </w:tc>
@@ -5961,7 +6469,7 @@
                 <w:b w:val="0"/>
                 <w:sz w:val="19"/>
               </w:rPr>
-              <w:t>≥92%</w:t>
+              <w:t>P≥95% / R≥85%</w:t>
             </w:r>
           </w:p>
         </w:tc>
@@ -5977,7 +6485,7 @@
                 <w:b w:val="0"/>
                 <w:sz w:val="19"/>
               </w:rPr>
-              <w:t>≥96%</w:t>
+              <w:t>P≥97% / R≥92%</w:t>
             </w:r>
           </w:p>
         </w:tc>
@@ -5993,41 +6501,7 @@
                 <w:b w:val="0"/>
                 <w:sz w:val="19"/>
               </w:rPr>
-              <w:t xml:space="preserve">熟人→陌生人、陌生人→熟人双向混淆分开统计；红外场景允许输出 </w:t>
-            </w:r>
-            <w:r>
-              <w:rPr>
-                <w:rFonts w:ascii="Consolas" w:hAnsi="Consolas" w:eastAsia="等线"/>
-                <w:b w:val="0"/>
-                <w:color w:val="C7254E"/>
-                <w:sz w:val="19"/>
-              </w:rPr>
-              <w:t>unknown</w:t>
-            </w:r>
-            <w:r>
-              <w:rPr>
-                <w:rFonts w:ascii="Calibri" w:hAnsi="Calibri" w:eastAsia="微软雅黑"/>
-                <w:b w:val="0"/>
-                <w:sz w:val="19"/>
-              </w:rPr>
-              <w:t xml:space="preserve"> 且 </w:t>
-            </w:r>
-            <w:r>
-              <w:rPr>
-                <w:rFonts w:ascii="Consolas" w:hAnsi="Consolas" w:eastAsia="等线"/>
-                <w:b w:val="0"/>
-                <w:color w:val="C7254E"/>
-                <w:sz w:val="19"/>
-              </w:rPr>
-              <w:t>unknown</w:t>
-            </w:r>
-            <w:r>
-              <w:rPr>
-                <w:rFonts w:ascii="Calibri" w:hAnsi="Calibri" w:eastAsia="微软雅黑"/>
-                <w:b w:val="0"/>
-                <w:sz w:val="19"/>
-              </w:rPr>
-              <w:t xml:space="preserve"> 占比≤20%</w:t>
+              <w:t>熟人误标陌生人会引发误告警，P 优先</w:t>
             </w:r>
           </w:p>
         </w:tc>
@@ -6044,7 +6518,7 @@
                 <w:b w:val="0"/>
                 <w:sz w:val="19"/>
               </w:rPr>
-              <w:t xml:space="preserve">S4 </w:t>
+              <w:t xml:space="preserve">S2 </w:t>
             </w:r>
             <w:r>
               <w:rPr>
@@ -6053,7 +6527,7 @@
                 <w:color w:val="C7254E"/>
                 <w:sz w:val="19"/>
               </w:rPr>
-              <w:t>zone_id</w:t>
+              <w:t>person_identity</w:t>
             </w:r>
           </w:p>
         </w:tc>
@@ -6068,7 +6542,7 @@
                 <w:b w:val="0"/>
                 <w:sz w:val="19"/>
               </w:rPr>
-              <w:t>槽准确率</w:t>
+              <w:t>槽准确率（在事件被报出的前提下身份判对）</w:t>
             </w:r>
           </w:p>
         </w:tc>
@@ -6083,7 +6557,7 @@
                 <w:b w:val="0"/>
                 <w:sz w:val="19"/>
               </w:rPr>
-              <w:t>≥98%</w:t>
+              <w:t>≥92%</w:t>
             </w:r>
           </w:p>
         </w:tc>
@@ -6098,7 +6572,7 @@
                 <w:b w:val="0"/>
                 <w:sz w:val="19"/>
               </w:rPr>
-              <w:t>≥99.5%</w:t>
+              <w:t>≥96%</w:t>
             </w:r>
           </w:p>
         </w:tc>
@@ -6113,7 +6587,41 @@
                 <w:b w:val="0"/>
                 <w:sz w:val="19"/>
               </w:rPr>
-              <w:t>几何计算为主，误差来自脚点抖动</w:t>
+              <w:t xml:space="preserve">熟人→陌生人、陌生人→熟人双向混淆分开统计；红外场景允许输出 </w:t>
+            </w:r>
+            <w:r>
+              <w:rPr>
+                <w:rFonts w:ascii="Consolas" w:hAnsi="Consolas" w:eastAsia="等线"/>
+                <w:b w:val="0"/>
+                <w:color w:val="C7254E"/>
+                <w:sz w:val="19"/>
+              </w:rPr>
+              <w:t>unknown</w:t>
+            </w:r>
+            <w:r>
+              <w:rPr>
+                <w:rFonts w:ascii="Calibri" w:hAnsi="Calibri" w:eastAsia="微软雅黑"/>
+                <w:b w:val="0"/>
+                <w:sz w:val="19"/>
+              </w:rPr>
+              <w:t xml:space="preserve"> 且 </w:t>
+            </w:r>
+            <w:r>
+              <w:rPr>
+                <w:rFonts w:ascii="Consolas" w:hAnsi="Consolas" w:eastAsia="等线"/>
+                <w:b w:val="0"/>
+                <w:color w:val="C7254E"/>
+                <w:sz w:val="19"/>
+              </w:rPr>
+              <w:t>unknown</w:t>
+            </w:r>
+            <w:r>
+              <w:rPr>
+                <w:rFonts w:ascii="Calibri" w:hAnsi="Calibri" w:eastAsia="微软雅黑"/>
+                <w:b w:val="0"/>
+                <w:sz w:val="19"/>
+              </w:rPr>
+              <w:t xml:space="preserve"> 占比≤20%</w:t>
             </w:r>
           </w:p>
         </w:tc>
@@ -6131,7 +6639,7 @@
                 <w:b w:val="0"/>
                 <w:sz w:val="19"/>
               </w:rPr>
-              <w:t xml:space="preserve">S6 </w:t>
+              <w:t xml:space="preserve">S4 </w:t>
             </w:r>
             <w:r>
               <w:rPr>
@@ -6140,7 +6648,7 @@
                 <w:color w:val="C7254E"/>
                 <w:sz w:val="19"/>
               </w:rPr>
-              <w:t>global_person_id</w:t>
+              <w:t>zone_id</w:t>
             </w:r>
           </w:p>
         </w:tc>
@@ -6156,7 +6664,7 @@
                 <w:b w:val="0"/>
                 <w:sz w:val="19"/>
               </w:rPr>
-              <w:t>跨镜同一人合并正确率</w:t>
+              <w:t>槽准确率</w:t>
             </w:r>
           </w:p>
         </w:tc>
@@ -6172,7 +6680,7 @@
                 <w:b w:val="0"/>
                 <w:sz w:val="19"/>
               </w:rPr>
-              <w:t>≥85%</w:t>
+              <w:t>≥98%</w:t>
             </w:r>
           </w:p>
         </w:tc>
@@ -6188,7 +6696,7 @@
                 <w:b w:val="0"/>
                 <w:sz w:val="19"/>
               </w:rPr>
-              <w:t>≥92%</w:t>
+              <w:t>≥99.5%</w:t>
             </w:r>
           </w:p>
         </w:tc>
@@ -6204,7 +6712,7 @@
                 <w:b w:val="0"/>
                 <w:sz w:val="19"/>
               </w:rPr>
-              <w:t>错误合并（两人并成一人）单独统计 ≤3%</w:t>
+              <w:t>几何计算为主，误差来自脚点抖动</w:t>
             </w:r>
           </w:p>
         </w:tc>
@@ -6221,7 +6729,7 @@
                 <w:b w:val="0"/>
                 <w:sz w:val="19"/>
               </w:rPr>
-              <w:t xml:space="preserve">S7 </w:t>
+              <w:t xml:space="preserve">S6 </w:t>
             </w:r>
             <w:r>
               <w:rPr>
@@ -6230,7 +6738,7 @@
                 <w:color w:val="C7254E"/>
                 <w:sz w:val="19"/>
               </w:rPr>
-              <w:t>behavior_subtype</w:t>
+              <w:t>global_person_id</w:t>
             </w:r>
           </w:p>
         </w:tc>
@@ -6245,7 +6753,7 @@
                 <w:b w:val="0"/>
                 <w:sz w:val="19"/>
               </w:rPr>
-              <w:t>三子类分类准确率（事件为真徘徊前提下）</w:t>
+              <w:t>跨镜同一人合并正确率</w:t>
             </w:r>
           </w:p>
         </w:tc>
@@ -6290,7 +6798,7 @@
                 <w:b w:val="0"/>
                 <w:sz w:val="19"/>
               </w:rPr>
-              <w:t>子类错不影响告警正确性，属体验槽</w:t>
+              <w:t>错误合并（两人并成一人）单独统计 ≤3%</w:t>
             </w:r>
           </w:p>
         </w:tc>
@@ -6308,7 +6816,7 @@
                 <w:b w:val="0"/>
                 <w:sz w:val="19"/>
               </w:rPr>
-              <w:t xml:space="preserve">S8 </w:t>
+              <w:t xml:space="preserve">S7 </w:t>
             </w:r>
             <w:r>
               <w:rPr>
@@ -6317,7 +6825,7 @@
                 <w:color w:val="C7254E"/>
                 <w:sz w:val="19"/>
               </w:rPr>
-              <w:t>duration_sec</w:t>
+              <w:t>behavior_subtype</w:t>
             </w:r>
           </w:p>
         </w:tc>
@@ -6333,7 +6841,7 @@
                 <w:b w:val="0"/>
                 <w:sz w:val="19"/>
               </w:rPr>
-              <w:t>时长绝对误差</w:t>
+              <w:t>三子类分类准确率（事件为真徘徊前提下）</w:t>
             </w:r>
           </w:p>
         </w:tc>
@@ -6349,7 +6857,7 @@
                 <w:b w:val="0"/>
                 <w:sz w:val="19"/>
               </w:rPr>
-              <w:t>≤3s（90 分位）</w:t>
+              <w:t>≥85%</w:t>
             </w:r>
           </w:p>
         </w:tc>
@@ -6365,7 +6873,7 @@
                 <w:b w:val="0"/>
                 <w:sz w:val="19"/>
               </w:rPr>
-              <w:t>≤2s</w:t>
+              <w:t>≥92%</w:t>
             </w:r>
           </w:p>
         </w:tc>
@@ -6381,7 +6889,7 @@
                 <w:b w:val="0"/>
                 <w:sz w:val="19"/>
               </w:rPr>
-              <w:t>含 ID 中断续算场景</w:t>
+              <w:t>子类错不影响告警正确性，属体验槽</w:t>
             </w:r>
           </w:p>
         </w:tc>
@@ -6398,7 +6906,7 @@
                 <w:b w:val="0"/>
                 <w:sz w:val="19"/>
               </w:rPr>
-              <w:t xml:space="preserve">S11 </w:t>
+              <w:t xml:space="preserve">S8 </w:t>
             </w:r>
             <w:r>
               <w:rPr>
@@ -6407,15 +6915,7 @@
                 <w:color w:val="C7254E"/>
                 <w:sz w:val="19"/>
               </w:rPr>
-              <w:t>description</w:t>
-            </w:r>
-            <w:r>
-              <w:rPr>
-                <w:rFonts w:ascii="Calibri" w:hAnsi="Calibri" w:eastAsia="微软雅黑"/>
-                <w:b w:val="0"/>
-                <w:sz w:val="19"/>
-              </w:rPr>
-              <w:t>（LLM）</w:t>
+              <w:t>duration_sec</w:t>
             </w:r>
           </w:p>
         </w:tc>
@@ -6430,7 +6930,7 @@
                 <w:b w:val="0"/>
                 <w:sz w:val="19"/>
               </w:rPr>
-              <w:t>描述关键要素正确率（身份/人数/区域/行为四要素均对）</w:t>
+              <w:t>时长绝对误差</w:t>
             </w:r>
           </w:p>
         </w:tc>
@@ -6445,7 +6945,7 @@
                 <w:b w:val="0"/>
                 <w:sz w:val="19"/>
               </w:rPr>
-              <w:t>≥95%</w:t>
+              <w:t>≤3s（90 分位）</w:t>
             </w:r>
           </w:p>
         </w:tc>
@@ -6460,7 +6960,7 @@
                 <w:b w:val="0"/>
                 <w:sz w:val="19"/>
               </w:rPr>
-              <w:t>≥98%</w:t>
+              <w:t>≤2s</w:t>
             </w:r>
           </w:p>
         </w:tc>
@@ -6475,15 +6975,7 @@
                 <w:b w:val="0"/>
                 <w:sz w:val="19"/>
               </w:rPr>
-              <w:t>受约束解码 + 模板兜底；</w:t>
-            </w:r>
-            <w:r>
-              <w:rPr>
-                <w:rFonts w:ascii="Calibri" w:hAnsi="Calibri" w:eastAsia="微软雅黑"/>
-                <w:b/>
-                <w:sz w:val="19"/>
-              </w:rPr>
-              <w:t>幻觉率（描述出画面不存在的要素）≤1%</w:t>
+              <w:t>含 ID 中断续算场景</w:t>
             </w:r>
           </w:p>
         </w:tc>
@@ -6501,7 +6993,24 @@
                 <w:b w:val="0"/>
                 <w:sz w:val="19"/>
               </w:rPr>
-              <w:t>S11 生成延迟</w:t>
+              <w:t xml:space="preserve">S11 </w:t>
+            </w:r>
+            <w:r>
+              <w:rPr>
+                <w:rFonts w:ascii="Consolas" w:hAnsi="Consolas" w:eastAsia="等线"/>
+                <w:b w:val="0"/>
+                <w:color w:val="C7254E"/>
+                <w:sz w:val="19"/>
+              </w:rPr>
+              <w:t>description</w:t>
+            </w:r>
+            <w:r>
+              <w:rPr>
+                <w:rFonts w:ascii="Calibri" w:hAnsi="Calibri" w:eastAsia="微软雅黑"/>
+                <w:b w:val="0"/>
+                <w:sz w:val="19"/>
+              </w:rPr>
+              <w:t>（LLM）</w:t>
             </w:r>
           </w:p>
         </w:tc>
@@ -6517,7 +7026,7 @@
                 <w:b w:val="0"/>
                 <w:sz w:val="19"/>
               </w:rPr>
-              <w:t>事件触发→描述生成完成</w:t>
+              <w:t>描述关键要素正确率（身份/人数/区域/行为四要素均对）</w:t>
             </w:r>
           </w:p>
         </w:tc>
@@ -6533,7 +7042,7 @@
                 <w:b w:val="0"/>
                 <w:sz w:val="19"/>
               </w:rPr>
-              <w:t>≤2s</w:t>
+              <w:t>≥95%</w:t>
             </w:r>
           </w:p>
         </w:tc>
@@ -6549,7 +7058,7 @@
                 <w:b w:val="0"/>
                 <w:sz w:val="19"/>
               </w:rPr>
-              <w:t>≤1s</w:t>
+              <w:t>≥98%</w:t>
             </w:r>
           </w:p>
         </w:tc>
@@ -6565,7 +7074,15 @@
                 <w:b w:val="0"/>
                 <w:sz w:val="19"/>
               </w:rPr>
-              <w:t>Qwen3.5-4B INT4，NPU/iGPU 推理</w:t>
+              <w:t>受约束解码 + 模板兜底；</w:t>
+            </w:r>
+            <w:r>
+              <w:rPr>
+                <w:rFonts w:ascii="Calibri" w:hAnsi="Calibri" w:eastAsia="微软雅黑"/>
+                <w:b/>
+                <w:sz w:val="19"/>
+              </w:rPr>
+              <w:t>幻觉率（描述出画面不存在的要素）≤1%</w:t>
             </w:r>
           </w:p>
         </w:tc>
@@ -6582,16 +7099,7 @@
                 <w:b w:val="0"/>
                 <w:sz w:val="19"/>
               </w:rPr>
-              <w:t xml:space="preserve">S12 </w:t>
-            </w:r>
-            <w:r>
-              <w:rPr>
-                <w:rFonts w:ascii="Consolas" w:hAnsi="Consolas" w:eastAsia="等线"/>
-                <w:b w:val="0"/>
-                <w:color w:val="C7254E"/>
-                <w:sz w:val="19"/>
-              </w:rPr>
-              <w:t>confidence</w:t>
+              <w:t>S11 生成延迟</w:t>
             </w:r>
           </w:p>
         </w:tc>
@@ -6606,7 +7114,7 @@
                 <w:b w:val="0"/>
                 <w:sz w:val="19"/>
               </w:rPr>
-              <w:t>校准误差 ECE</w:t>
+              <w:t>事件触发→描述生成完成</w:t>
             </w:r>
           </w:p>
         </w:tc>
@@ -6621,7 +7129,7 @@
                 <w:b w:val="0"/>
                 <w:sz w:val="19"/>
               </w:rPr>
-              <w:t>≤0.1</w:t>
+              <w:t>≤2s</w:t>
             </w:r>
           </w:p>
         </w:tc>
@@ -6636,13 +7144,104 @@
                 <w:b w:val="0"/>
                 <w:sz w:val="19"/>
               </w:rPr>
-              <w:t>≤0.05</w:t>
+              <w:t>≤1s</w:t>
             </w:r>
           </w:p>
         </w:tc>
         <w:tc>
           <w:tcPr>
             <w:tcW w:type="dxa" w:w="1904"/>
+          </w:tcPr>
+          <w:p>
+            <w:r>
+              <w:rPr>
+                <w:rFonts w:ascii="Calibri" w:hAnsi="Calibri" w:eastAsia="微软雅黑"/>
+                <w:b w:val="0"/>
+                <w:sz w:val="19"/>
+              </w:rPr>
+              <w:t>Qwen3.5-4B INT4，NPU/iGPU 推理</w:t>
+            </w:r>
+          </w:p>
+        </w:tc>
+      </w:tr>
+      <w:tr>
+        <w:tc>
+          <w:tcPr>
+            <w:tcW w:type="dxa" w:w="1904"/>
+            <w:shd w:val="clear" w:fill="EDF2F8"/>
+          </w:tcPr>
+          <w:p>
+            <w:r>
+              <w:rPr>
+                <w:rFonts w:ascii="Calibri" w:hAnsi="Calibri" w:eastAsia="微软雅黑"/>
+                <w:b w:val="0"/>
+                <w:sz w:val="19"/>
+              </w:rPr>
+              <w:t xml:space="preserve">S12 </w:t>
+            </w:r>
+            <w:r>
+              <w:rPr>
+                <w:rFonts w:ascii="Consolas" w:hAnsi="Consolas" w:eastAsia="等线"/>
+                <w:b w:val="0"/>
+                <w:color w:val="C7254E"/>
+                <w:sz w:val="19"/>
+              </w:rPr>
+              <w:t>confidence</w:t>
+            </w:r>
+          </w:p>
+        </w:tc>
+        <w:tc>
+          <w:tcPr>
+            <w:tcW w:type="dxa" w:w="1904"/>
+            <w:shd w:val="clear" w:fill="EDF2F8"/>
+          </w:tcPr>
+          <w:p>
+            <w:r>
+              <w:rPr>
+                <w:rFonts w:ascii="Calibri" w:hAnsi="Calibri" w:eastAsia="微软雅黑"/>
+                <w:b w:val="0"/>
+                <w:sz w:val="19"/>
+              </w:rPr>
+              <w:t>校准误差 ECE</w:t>
+            </w:r>
+          </w:p>
+        </w:tc>
+        <w:tc>
+          <w:tcPr>
+            <w:tcW w:type="dxa" w:w="1904"/>
+            <w:shd w:val="clear" w:fill="EDF2F8"/>
+          </w:tcPr>
+          <w:p>
+            <w:r>
+              <w:rPr>
+                <w:rFonts w:ascii="Calibri" w:hAnsi="Calibri" w:eastAsia="微软雅黑"/>
+                <w:b w:val="0"/>
+                <w:sz w:val="19"/>
+              </w:rPr>
+              <w:t>≤0.1</w:t>
+            </w:r>
+          </w:p>
+        </w:tc>
+        <w:tc>
+          <w:tcPr>
+            <w:tcW w:type="dxa" w:w="1904"/>
+            <w:shd w:val="clear" w:fill="EDF2F8"/>
+          </w:tcPr>
+          <w:p>
+            <w:r>
+              <w:rPr>
+                <w:rFonts w:ascii="Calibri" w:hAnsi="Calibri" w:eastAsia="微软雅黑"/>
+                <w:b w:val="0"/>
+                <w:sz w:val="19"/>
+              </w:rPr>
+              <w:t>≤0.05</w:t>
+            </w:r>
+          </w:p>
+        </w:tc>
+        <w:tc>
+          <w:tcPr>
+            <w:tcW w:type="dxa" w:w="1904"/>
+            <w:shd w:val="clear" w:fill="EDF2F8"/>
           </w:tcPr>
           <w:p>
             <w:r>
@@ -6933,7 +7532,7 @@
           <w:b w:val="0"/>
           <w:sz w:val="21"/>
         </w:rPr>
-        <w:t>：驻留时长与折返比是确定性计算，事件错误几乎全部来自上游（检测漏检 → 计时断、ID switch → 时长算错、身份错 → 该报的没报）。按 A 表帧级指标做误差传播估算，30s 窗口内维持同一 ID 的成功率约 92–95%，与论文报告的 85–95% 区间一致，故 P0 取 90/85 可达且有余量。</w:t>
+        <w:t>：出现时长是确定性计算，事件错误几乎全部来自上游（检测漏检 → 计时断、ID switch → 时长算错、身份错 → 细分报错）。按 A 表帧级指标做误差传播估算，30s 窗口内维持同一 ID 的成功率约 92–95%，与论文报告的 85–95% 区间一致，故 P0 取 90/85 可达且有余量。</w:t>
       </w:r>
     </w:p>
     <w:p>
@@ -6996,6 +7595,203 @@
           <w:sz w:val="21"/>
         </w:rPr>
         <w:t>：NIST FRTE 1:N 头部算法 FNIR≈0.2% 是受控画质；IJB-C（含监控帧）TAR@FAR=1e-4 顶尖也仅 97.4%，且为大模型非端侧。端侧轻量模型 + 红外 + 大角度俯拍，P0 定 90%（白天）/80%（红外）是有公开依据支撑的工程可达值，不应对齐门禁机指标。</w:t>
+      </w:r>
+    </w:p>
+    <w:p>
+      <w:pPr>
+        <w:spacing w:before="200" w:after="120"/>
+        <w:outlineLvl w:val="2"/>
+      </w:pPr>
+      <w:r>
+        <w:rPr>
+          <w:rFonts w:ascii="Calibri" w:hAnsi="Calibri" w:eastAsia="微软雅黑"/>
+          <w:b/>
+          <w:color w:val="1F4E79"/>
+          <w:sz w:val="25"/>
+        </w:rPr>
+        <w:t>7.5 夜晚红外场景的指标评估规则</w:t>
+      </w:r>
+    </w:p>
+    <w:p>
+      <w:pPr>
+        <w:spacing w:after="120"/>
+      </w:pPr>
+      <w:r>
+        <w:rPr>
+          <w:rFonts w:ascii="Calibri" w:hAnsi="Calibri" w:eastAsia="微软雅黑"/>
+          <w:b w:val="0"/>
+          <w:sz w:val="21"/>
+        </w:rPr>
+        <w:t>夜晚红外场景</w:t>
+      </w:r>
+      <w:r>
+        <w:rPr>
+          <w:rFonts w:ascii="Calibri" w:hAnsi="Calibri" w:eastAsia="微软雅黑"/>
+          <w:b/>
+          <w:sz w:val="21"/>
+        </w:rPr>
+        <w:t>接受误报略高于白天</w:t>
+      </w:r>
+      <w:r>
+        <w:rPr>
+          <w:rFonts w:ascii="Calibri" w:hAnsi="Calibri" w:eastAsia="微软雅黑"/>
+          <w:b w:val="0"/>
+          <w:sz w:val="21"/>
+        </w:rPr>
+        <w:t>，按以下规则评估：</w:t>
+      </w:r>
+    </w:p>
+    <w:p>
+      <w:pPr>
+        <w:pStyle w:val="ListBullet"/>
+        <w:spacing w:after="40"/>
+      </w:pPr>
+      <w:r>
+        <w:rPr>
+          <w:rFonts w:ascii="Calibri" w:hAnsi="Calibri" w:eastAsia="微软雅黑"/>
+          <w:b/>
+          <w:sz w:val="21"/>
+        </w:rPr>
+        <w:t>缺省口径（降 5% 评估）</w:t>
+      </w:r>
+      <w:r>
+        <w:rPr>
+          <w:rFonts w:ascii="Calibri" w:hAnsi="Calibri" w:eastAsia="微软雅黑"/>
+          <w:b w:val="0"/>
+          <w:sz w:val="21"/>
+        </w:rPr>
+        <w:t>：事件级精确率/召回率在白天 P0/P1 基础上</w:t>
+      </w:r>
+      <w:r>
+        <w:rPr>
+          <w:rFonts w:ascii="Calibri" w:hAnsi="Calibri" w:eastAsia="微软雅黑"/>
+          <w:b/>
+          <w:sz w:val="21"/>
+        </w:rPr>
+        <w:t>放宽 5 个百分点</w:t>
+      </w:r>
+      <w:r>
+        <w:rPr>
+          <w:rFonts w:ascii="Calibri" w:hAnsi="Calibri" w:eastAsia="微软雅黑"/>
+          <w:b w:val="0"/>
+          <w:sz w:val="21"/>
+        </w:rPr>
+        <w:t xml:space="preserve">。例如徘徊事件白天 P0 为 P≥90% / R≥85%，夜晚红外按 </w:t>
+      </w:r>
+      <w:r>
+        <w:rPr>
+          <w:rFonts w:ascii="Calibri" w:hAnsi="Calibri" w:eastAsia="微软雅黑"/>
+          <w:b/>
+          <w:sz w:val="21"/>
+        </w:rPr>
+        <w:t>P≥85% / R≥80%</w:t>
+      </w:r>
+      <w:r>
+        <w:rPr>
+          <w:rFonts w:ascii="Calibri" w:hAnsi="Calibri" w:eastAsia="微软雅黑"/>
+          <w:b w:val="0"/>
+          <w:sz w:val="21"/>
+        </w:rPr>
+        <w:t xml:space="preserve"> 评估；FAR 放宽至 </w:t>
+      </w:r>
+      <w:r>
+        <w:rPr>
+          <w:rFonts w:ascii="Calibri" w:hAnsi="Calibri" w:eastAsia="微软雅黑"/>
+          <w:b/>
+          <w:sz w:val="21"/>
+        </w:rPr>
+        <w:t>≤2 次/路/天</w:t>
+      </w:r>
+      <w:r>
+        <w:rPr>
+          <w:rFonts w:ascii="Calibri" w:hAnsi="Calibri" w:eastAsia="微软雅黑"/>
+          <w:b w:val="0"/>
+          <w:sz w:val="21"/>
+        </w:rPr>
+        <w:t>。</w:t>
+      </w:r>
+    </w:p>
+    <w:p>
+      <w:pPr>
+        <w:pStyle w:val="ListBullet"/>
+        <w:spacing w:after="40"/>
+      </w:pPr>
+      <w:r>
+        <w:rPr>
+          <w:rFonts w:ascii="Calibri" w:hAnsi="Calibri" w:eastAsia="微软雅黑"/>
+          <w:b/>
+          <w:sz w:val="21"/>
+        </w:rPr>
+        <w:t>以算法侧实测建议为准</w:t>
+      </w:r>
+      <w:r>
+        <w:rPr>
+          <w:rFonts w:ascii="Calibri" w:hAnsi="Calibri" w:eastAsia="微软雅黑"/>
+          <w:b w:val="0"/>
+          <w:sz w:val="21"/>
+        </w:rPr>
+        <w:t>：上述"降 5%"是算法侧未给出建议时的缺省评估口径；若算法侧在红外测试集上给出实测建议值（无论更优或更保守），以算法侧建议更新本表并重新评审。</w:t>
+      </w:r>
+    </w:p>
+    <w:p>
+      <w:pPr>
+        <w:pStyle w:val="ListBullet"/>
+        <w:spacing w:after="40"/>
+      </w:pPr>
+      <w:r>
+        <w:rPr>
+          <w:rFonts w:ascii="Calibri" w:hAnsi="Calibri" w:eastAsia="微软雅黑"/>
+          <w:b/>
+          <w:sz w:val="21"/>
+        </w:rPr>
+        <w:t>身份槽放宽</w:t>
+      </w:r>
+      <w:r>
+        <w:rPr>
+          <w:rFonts w:ascii="Calibri" w:hAnsi="Calibri" w:eastAsia="微软雅黑"/>
+          <w:b w:val="0"/>
+          <w:sz w:val="21"/>
+        </w:rPr>
+        <w:t>：夜晚红外下身份允许更高比例输出"未知"（</w:t>
+      </w:r>
+      <w:r>
+        <w:rPr>
+          <w:rFonts w:ascii="Consolas" w:hAnsi="Consolas" w:eastAsia="等线"/>
+          <w:b w:val="0"/>
+          <w:color w:val="C7254E"/>
+          <w:sz w:val="21"/>
+        </w:rPr>
+        <w:t>unknown</w:t>
+      </w:r>
+      <w:r>
+        <w:rPr>
+          <w:rFonts w:ascii="Calibri" w:hAnsi="Calibri" w:eastAsia="微软雅黑"/>
+          <w:b w:val="0"/>
+          <w:sz w:val="21"/>
+        </w:rPr>
+        <w:t xml:space="preserve"> 占比 ≤35%，白天 ≤20%）；身份未知不影响徘徊事件本身的触发与上报（按"有人徘徊"口径上报）。</w:t>
+      </w:r>
+    </w:p>
+    <w:p>
+      <w:pPr>
+        <w:pStyle w:val="ListBullet"/>
+        <w:spacing w:after="40"/>
+      </w:pPr>
+      <w:r>
+        <w:rPr>
+          <w:rFonts w:ascii="Calibri" w:hAnsi="Calibri" w:eastAsia="微软雅黑"/>
+          <w:b/>
+          <w:sz w:val="21"/>
+        </w:rPr>
+        <w:t>统计口径</w:t>
+      </w:r>
+      <w:r>
+        <w:rPr>
+          <w:rFonts w:ascii="Calibri" w:hAnsi="Calibri" w:eastAsia="微软雅黑"/>
+          <w:b w:val="0"/>
+          <w:sz w:val="21"/>
+        </w:rPr>
+        <w:t>：夜晚红外指标单独分列统计，不与白天混合平均；验收测试集中夜晚红外样本占比不低于 30%（见第 9 章配比）。</w:t>
       </w:r>
     </w:p>
     <w:p>
@@ -7403,7 +8199,7 @@
                 <w:b w:val="0"/>
                 <w:sz w:val="19"/>
               </w:rPr>
-              <w:t>目标进入 ROI / ID 待重关联时触发</w:t>
+              <w:t>目标进入圈定区域 / ID 待重关联时触发</w:t>
             </w:r>
           </w:p>
         </w:tc>
@@ -7576,7 +8372,7 @@
           <w:b w:val="0"/>
           <w:sz w:val="21"/>
         </w:rPr>
-        <w:t>：&gt;4 路时检测降到 6–8 fps；同屏 &gt;10 人时人脸/ReID 只处理 ROI 内目标；LLM 生成排队不阻塞告警推送（先推模板文案，描述生成后更新卡片）。</w:t>
+        <w:t>：&gt;4 路时检测降到 6–8 fps；同屏 &gt;10 人时人脸/ReID 只处理圈定区域内目标；LLM 生成排队不阻塞告警推送（先推固定文案，描述生成后更新卡片）。</w:t>
       </w:r>
     </w:p>
     <w:p>
@@ -7622,7 +8418,7 @@
           <w:b w:val="0"/>
           <w:sz w:val="21"/>
         </w:rPr>
-        <w:t>：≥50 个点位、≥200 小时录像；徘徊正样本 ≥300 段（静止/来回/反复三子类各 ≥80），负样本含 3.3 节全部边界场景；日/夜/雨雪按 5:3:2 配比；每段标注真值词槽（S1–S9）。</w:t>
+        <w:t>：≥50 个点位、≥200 小时录像；徘徊正样本 ≥300 段（静止/来回/移动三子类各 ≥80，有人徘徊与陌生人徘徊两类身份均覆盖），负样本含 3.3 节全部边界场景；日/夜/雨雪按 5:3:2 配比；每段标注真值词槽（S1–S9）。</w:t>
       </w:r>
     </w:p>
     <w:p>
@@ -8074,7 +8870,7 @@
                 <w:b w:val="0"/>
                 <w:sz w:val="19"/>
               </w:rPr>
-              <w:t>单路：检测+跟踪+ROI 徘徊状态机</w:t>
+              <w:t>单路：检测+跟踪+圈定区域徘徊状态机</w:t>
             </w:r>
           </w:p>
         </w:tc>

</xml_diff>